<commit_message>
1 Reject + Interview with XERO
</commit_message>
<xml_diff>
--- a/Applications/Xero/Lead Platform Engineer - Salesforce/Efraim Taranto - Cover Letter.docx
+++ b/Applications/Xero/Lead Platform Engineer - Salesforce/Efraim Taranto - Cover Letter.docx
@@ -150,22 +150,7 @@
         <w:jc w:val="right"/>
       </w:pPr>
       <w:r>
-        <w:fldChar w:fldCharType="begin"/>
-      </w:r>
-      <w:r>
-        <w:instrText xml:space="preserve"> DATE \@ "d MMMM yyyy" </w:instrText>
-      </w:r>
-      <w:r>
-        <w:fldChar w:fldCharType="separate"/>
-      </w:r>
-      <w:r>
-        <w:rPr>
-          <w:noProof/>
-        </w:rPr>
         <w:t>10 September 2026</w:t>
-      </w:r>
-      <w:r>
-        <w:fldChar w:fldCharType="end"/>
       </w:r>
     </w:p>
     <w:p>
@@ -225,21 +210,13 @@
         </w:rPr>
       </w:pPr>
       <w:r>
-        <w:t xml:space="preserve">I am applying for the Lead Platform Engineer – Salesforce role at Xero. I bring enterprise-scale Salesforce leadership and hands-on experience across platform architecture, software development, test automation and operational </w:t>
-      </w:r>
-      <w:proofErr w:type="spellStart"/>
-      <w:r>
-        <w:t>su</w:t>
-      </w:r>
-      <w:r>
-        <w:t>`</w:t>
-      </w:r>
-      <w:r>
-        <w:t>pport</w:t>
-      </w:r>
-      <w:proofErr w:type="spellEnd"/>
-      <w:r>
-        <w:t>. Throughout my career, I have translated complex organisational needs into secure, sustainable platform improvements, creating the technical foundations, governance and tooling that enable engineering teams to deliver independently while maintaining quality and operational discipline.</w:t>
+        <w:t xml:space="preserve">I am applying for the Lead Platform Engineer </w:t>
+      </w:r>
+      <w:r>
+        <w:t>-</w:t>
+      </w:r>
+      <w:r>
+        <w:t xml:space="preserve"> Salesforce role at Xero. I bring enterprise-scale Salesforce leadership and hands-on experience across platform architecture, software development, test automation and operational support. Throughout my career, I have translated complex organisational needs into secure, sustainable platform improvements, creating the technical foundations, governance and tooling that enable engineering teams to deliver independently while maintaining quality and operational discipline.</w:t>
       </w:r>
     </w:p>
     <w:p>
@@ -250,29 +227,13 @@
         </w:rPr>
       </w:pPr>
       <w:r>
-        <w:t xml:space="preserve">In my most recent role, I led Salesforce DevSecOps and release engineering across multiple orgs, vendors and business units. I modernised CI/CD with human review, GitHub Copilot, </w:t>
-      </w:r>
-      <w:proofErr w:type="spellStart"/>
-      <w:r>
-        <w:t>Snyk</w:t>
-      </w:r>
-      <w:proofErr w:type="spellEnd"/>
-      <w:r>
-        <w:t xml:space="preserve"> checks and automated regression testing, reducing post-release incidents by approximately 90% and enabling teams to manage scheduled, off-cycle and hotfix releases independently. I remained hands-on </w:t>
+        <w:t xml:space="preserve">In my most recent role, I led Salesforce DevSecOps and release engineering across multiple orgs, vendors and business units. I modernised CI/CD with human review, GitHub Copilot, Snyk checks and automated regression testing, reducing post-release incidents by approximately 90% and enabling teams to manage scheduled, off-cycle and hotfix releases independently. I remained hands-on </w:t>
       </w:r>
       <w:r>
         <w:t>development</w:t>
       </w:r>
       <w:r>
-        <w:t xml:space="preserve">, resolving governor-limit constraints, migrating legacy automation to </w:t>
-      </w:r>
-      <w:proofErr w:type="spellStart"/>
-      <w:r>
-        <w:t>bulkified</w:t>
-      </w:r>
-      <w:proofErr w:type="spellEnd"/>
-      <w:r>
-        <w:t xml:space="preserve"> Flow and introducing Selenium</w:t>
+        <w:t>, resolving governor-limit constraints, migrating legacy automation to bulkified Flow and introducing Selenium</w:t>
       </w:r>
       <w:r>
         <w:t>-</w:t>
@@ -301,10 +262,7 @@
         <w:t xml:space="preserve">At Origin Energy, </w:t>
       </w:r>
       <w:r>
-        <w:t>working along with Business Users and SMEs</w:t>
-      </w:r>
-      <w:r>
-        <w:t xml:space="preserve">, </w:t>
+        <w:t xml:space="preserve">working along with Business Users and SMEs, </w:t>
       </w:r>
       <w:r>
         <w:t xml:space="preserve">I </w:t>
@@ -313,15 +271,7 @@
         <w:t xml:space="preserve">designed and </w:t>
       </w:r>
       <w:r>
-        <w:t xml:space="preserve">architected the LPG Sales Pipeline Accelerator, identifying practical applications for </w:t>
-      </w:r>
-      <w:proofErr w:type="spellStart"/>
-      <w:r>
-        <w:t>Agentforce</w:t>
-      </w:r>
-      <w:proofErr w:type="spellEnd"/>
-      <w:r>
-        <w:t xml:space="preserve"> in field sales and for Data360 in lead revival, acquisition, retention and next-best-action use cases. I also designed and developed a recurring gas-delivery solution that automated customer orders according to predefined demand conditions. These initiatives required me to translate emerging platform capabilities and complex operational requirements into practical, scalable solutions.</w:t>
+        <w:t>architected the LPG Sales Pipeline Accelerator, identifying practical applications for Agentforce in field sales and for Data360 in lead revival, acquisition, retention and next-best-action use cases. I also designed and developed a recurring gas-delivery solution that automated customer orders according to predefined demand conditions. These initiatives required me to translate emerging platform capabilities and complex operational requirements into practical, scalable solutions.</w:t>
       </w:r>
     </w:p>
     <w:p>

</xml_diff>